<commit_message>
docs(s01-3): warn against For each wrapping Populate Word template action
</commit_message>
<xml_diff>
--- a/assets/files/회의록_템플릿_Tier3.docx
+++ b/assets/files/회의록_템플릿_Tier3.docx
@@ -21,43 +21,7 @@
           <w:color w:val="1F3864"/>
           <w:sz w:val="72"/>
         </w:rPr>
-        <w:t>회</w:t>
-      </w:r>
-      <w:r>
-        <w:rPr>
-          <w:rFonts w:eastAsia="맑은 고딕"/>
-          <w:b/>
-          <w:color w:val="1F3864"/>
-          <w:sz w:val="72"/>
-        </w:rPr>
-        <w:t xml:space="preserve"> </w:t>
-      </w:r>
-      <w:r>
-        <w:rPr>
-          <w:rFonts w:eastAsia="맑은 고딕"/>
-          <w:b/>
-          <w:color w:val="1F3864"/>
-          <w:sz w:val="72"/>
-        </w:rPr>
-        <w:t>의</w:t>
-      </w:r>
-      <w:r>
-        <w:rPr>
-          <w:rFonts w:eastAsia="맑은 고딕"/>
-          <w:b/>
-          <w:color w:val="1F3864"/>
-          <w:sz w:val="72"/>
-        </w:rPr>
-        <w:t xml:space="preserve"> </w:t>
-      </w:r>
-      <w:r>
-        <w:rPr>
-          <w:rFonts w:eastAsia="맑은 고딕"/>
-          <w:b/>
-          <w:color w:val="1F3864"/>
-          <w:sz w:val="72"/>
-        </w:rPr>
-        <w:t>록</w:t>
+        <w:t>회 의 록</w:t>
       </w:r>
     </w:p>
     <w:p>
@@ -78,34 +42,7 @@
           <w:color w:val="1F3864"/>
           <w:sz w:val="32"/>
         </w:rPr>
-        <w:t xml:space="preserve">1. </w:t>
-      </w:r>
-      <w:r>
-        <w:rPr>
-          <w:rFonts w:eastAsia="맑은 고딕"/>
-          <w:b/>
-          <w:color w:val="1F3864"/>
-          <w:sz w:val="32"/>
-        </w:rPr>
-        <w:t>기본</w:t>
-      </w:r>
-      <w:r>
-        <w:rPr>
-          <w:rFonts w:eastAsia="맑은 고딕"/>
-          <w:b/>
-          <w:color w:val="1F3864"/>
-          <w:sz w:val="32"/>
-        </w:rPr>
-        <w:t xml:space="preserve"> </w:t>
-      </w:r>
-      <w:r>
-        <w:rPr>
-          <w:rFonts w:eastAsia="맑은 고딕"/>
-          <w:b/>
-          <w:color w:val="1F3864"/>
-          <w:sz w:val="32"/>
-        </w:rPr>
-        <w:t>정보</w:t>
+        <w:t>1. 기본 정보</w:t>
       </w:r>
     </w:p>
     <w:tbl>
@@ -137,21 +74,7 @@
                 <w:rFonts w:eastAsia="맑은 고딕"/>
                 <w:b/>
               </w:rPr>
-              <w:t>회의</w:t>
-            </w:r>
-            <w:r>
-              <w:rPr>
-                <w:rFonts w:eastAsia="맑은 고딕"/>
-                <w:b/>
-              </w:rPr>
-              <w:t xml:space="preserve"> </w:t>
-            </w:r>
-            <w:r>
-              <w:rPr>
-                <w:rFonts w:eastAsia="맑은 고딕"/>
-                <w:b/>
-              </w:rPr>
-              <w:t>제목</w:t>
+              <w:t>회의 제목</w:t>
             </w:r>
           </w:p>
         </w:tc>
@@ -172,10 +95,12 @@
                 <w:alias w:val="title"/>
                 <w:tag w:val="title"/>
                 <w:id w:val="11125040"/>
+                <w:placeholder>
+                  <w:docPart w:val="107DDFF9D1B94226A246A160F3B26374"/>
+                </w:placeholder>
                 <w:showingPlcHdr/>
                 <w:text w:multiLine="1"/>
               </w:sdtPr>
-              <w:sdtEndPr/>
               <w:sdtContent>
                 <w:r>
                   <w:t>title</w:t>
@@ -225,10 +150,12 @@
                 <w:alias w:val="meetingDate"/>
                 <w:tag w:val="meetingDate"/>
                 <w:id w:val="21765044"/>
+                <w:placeholder>
+                  <w:docPart w:val="FD2061C14E4C4B6DBF52273A29DE5D26"/>
+                </w:placeholder>
                 <w:showingPlcHdr/>
                 <w:text w:multiLine="1"/>
               </w:sdtPr>
-              <w:sdtEndPr/>
               <w:sdtContent>
                 <w:r>
                   <w:t>meetingDate</w:t>
@@ -278,10 +205,12 @@
                 <w:alias w:val="location"/>
                 <w:tag w:val="location"/>
                 <w:id w:val="97596850"/>
+                <w:placeholder>
+                  <w:docPart w:val="62D005E8D20A4324A27598EAD9372AA1"/>
+                </w:placeholder>
                 <w:showingPlcHdr/>
                 <w:text w:multiLine="1"/>
               </w:sdtPr>
-              <w:sdtEndPr/>
               <w:sdtContent>
                 <w:r>
                   <w:t>location</w:t>
@@ -303,16 +232,7 @@
           <w:color w:val="1F3864"/>
           <w:sz w:val="32"/>
         </w:rPr>
-        <w:t xml:space="preserve">2. </w:t>
-      </w:r>
-      <w:r>
-        <w:rPr>
-          <w:rFonts w:eastAsia="맑은 고딕"/>
-          <w:b/>
-          <w:color w:val="1F3864"/>
-          <w:sz w:val="32"/>
-        </w:rPr>
-        <w:t>참석자</w:t>
+        <w:t>2. 참석자</w:t>
       </w:r>
     </w:p>
     <w:tbl>
@@ -321,7 +241,7 @@
         <w:tblLook w:val="04A0" w:firstRow="1" w:lastRow="0" w:firstColumn="1" w:lastColumn="0" w:noHBand="0" w:noVBand="1"/>
       </w:tblPr>
       <w:tblGrid>
-        <w:gridCol w:w="9406"/>
+        <w:gridCol w:w="9396"/>
       </w:tblGrid>
       <w:tr>
         <w:tc>
@@ -340,10 +260,12 @@
                 <w:alias w:val="attendees"/>
                 <w:tag w:val="attendees"/>
                 <w:id w:val="71116569"/>
+                <w:placeholder>
+                  <w:docPart w:val="1058E08B3A00462C997C044C52636E00"/>
+                </w:placeholder>
                 <w:showingPlcHdr/>
                 <w:text w:multiLine="1"/>
               </w:sdtPr>
-              <w:sdtEndPr/>
               <w:sdtContent>
                 <w:r>
                   <w:t>attendees</w:t>
@@ -365,16 +287,7 @@
           <w:color w:val="1F3864"/>
           <w:sz w:val="32"/>
         </w:rPr>
-        <w:t xml:space="preserve">3. </w:t>
-      </w:r>
-      <w:r>
-        <w:rPr>
-          <w:rFonts w:eastAsia="맑은 고딕"/>
-          <w:b/>
-          <w:color w:val="1F3864"/>
-          <w:sz w:val="32"/>
-        </w:rPr>
-        <w:t>안건</w:t>
+        <w:t>3. 안건</w:t>
       </w:r>
     </w:p>
     <w:tbl>
@@ -383,7 +296,7 @@
         <w:tblLook w:val="04A0" w:firstRow="1" w:lastRow="0" w:firstColumn="1" w:lastColumn="0" w:noHBand="0" w:noVBand="1"/>
       </w:tblPr>
       <w:tblGrid>
-        <w:gridCol w:w="9406"/>
+        <w:gridCol w:w="9396"/>
       </w:tblGrid>
       <w:tr>
         <w:tc>
@@ -402,10 +315,12 @@
                 <w:alias w:val="agenda"/>
                 <w:tag w:val="agenda"/>
                 <w:id w:val="56260867"/>
+                <w:placeholder>
+                  <w:docPart w:val="C71646578BBD43839A59C323FCEA5693"/>
+                </w:placeholder>
                 <w:showingPlcHdr/>
                 <w:text w:multiLine="1"/>
               </w:sdtPr>
-              <w:sdtEndPr/>
               <w:sdtContent>
                 <w:r>
                   <w:t>agenda</w:t>
@@ -427,34 +342,7 @@
           <w:color w:val="1F3864"/>
           <w:sz w:val="32"/>
         </w:rPr>
-        <w:t xml:space="preserve">4. </w:t>
-      </w:r>
-      <w:r>
-        <w:rPr>
-          <w:rFonts w:eastAsia="맑은 고딕"/>
-          <w:b/>
-          <w:color w:val="1F3864"/>
-          <w:sz w:val="32"/>
-        </w:rPr>
-        <w:t>결정</w:t>
-      </w:r>
-      <w:r>
-        <w:rPr>
-          <w:rFonts w:eastAsia="맑은 고딕"/>
-          <w:b/>
-          <w:color w:val="1F3864"/>
-          <w:sz w:val="32"/>
-        </w:rPr>
-        <w:t xml:space="preserve"> </w:t>
-      </w:r>
-      <w:r>
-        <w:rPr>
-          <w:rFonts w:eastAsia="맑은 고딕"/>
-          <w:b/>
-          <w:color w:val="1F3864"/>
-          <w:sz w:val="32"/>
-        </w:rPr>
-        <w:t>사항</w:t>
+        <w:t>4. 결정 사항</w:t>
       </w:r>
     </w:p>
     <w:tbl>
@@ -463,7 +351,7 @@
         <w:tblLook w:val="04A0" w:firstRow="1" w:lastRow="0" w:firstColumn="1" w:lastColumn="0" w:noHBand="0" w:noVBand="1"/>
       </w:tblPr>
       <w:tblGrid>
-        <w:gridCol w:w="9406"/>
+        <w:gridCol w:w="9396"/>
       </w:tblGrid>
       <w:tr>
         <w:tc>
@@ -482,10 +370,12 @@
                 <w:alias w:val="decisions"/>
                 <w:tag w:val="decisions"/>
                 <w:id w:val="70048820"/>
+                <w:placeholder>
+                  <w:docPart w:val="998CD899639047BBA27F141DA80F0355"/>
+                </w:placeholder>
                 <w:showingPlcHdr/>
                 <w:text w:multiLine="1"/>
               </w:sdtPr>
-              <w:sdtEndPr/>
               <w:sdtContent>
                 <w:r>
                   <w:t>decisions</w:t>
@@ -507,34 +397,7 @@
           <w:color w:val="1F3864"/>
           <w:sz w:val="32"/>
         </w:rPr>
-        <w:t xml:space="preserve">5. </w:t>
-      </w:r>
-      <w:r>
-        <w:rPr>
-          <w:rFonts w:eastAsia="맑은 고딕"/>
-          <w:b/>
-          <w:color w:val="1F3864"/>
-          <w:sz w:val="32"/>
-        </w:rPr>
-        <w:t>액션</w:t>
-      </w:r>
-      <w:r>
-        <w:rPr>
-          <w:rFonts w:eastAsia="맑은 고딕"/>
-          <w:b/>
-          <w:color w:val="1F3864"/>
-          <w:sz w:val="32"/>
-        </w:rPr>
-        <w:t xml:space="preserve"> </w:t>
-      </w:r>
-      <w:r>
-        <w:rPr>
-          <w:rFonts w:eastAsia="맑은 고딕"/>
-          <w:b/>
-          <w:color w:val="1F3864"/>
-          <w:sz w:val="32"/>
-        </w:rPr>
-        <w:t>아이템</w:t>
+        <w:t>5. 액션 아이템</w:t>
       </w:r>
     </w:p>
     <w:tbl>
@@ -543,9 +406,9 @@
         <w:tblLook w:val="04A0" w:firstRow="1" w:lastRow="0" w:firstColumn="1" w:lastColumn="0" w:noHBand="0" w:noVBand="1"/>
       </w:tblPr>
       <w:tblGrid>
-        <w:gridCol w:w="3135"/>
-        <w:gridCol w:w="3135"/>
-        <w:gridCol w:w="3135"/>
+        <w:gridCol w:w="3132"/>
+        <w:gridCol w:w="3132"/>
+        <w:gridCol w:w="3132"/>
       </w:tblGrid>
       <w:tr>
         <w:tc>
@@ -623,112 +486,172 @@
       </w:tr>
       <w:sdt>
         <w:sdtPr>
+          <w:rPr>
+            <w:rFonts w:eastAsia="맑은 고딕" w:hint="eastAsia"/>
+            <w:lang w:eastAsia="ko-KR"/>
+          </w:rPr>
           <w:alias w:val="actionItems"/>
           <w:tag w:val="actionItems"/>
-          <w:id w:val="68483320"/>
+          <w:id w:val="-1624532696"/>
+          <w15:repeatingSection/>
         </w:sdtPr>
-        <w:sdtEndPr/>
+        <w:sdtEndPr>
+          <w:rPr>
+            <w:rFonts w:eastAsiaTheme="minorEastAsia" w:hint="default"/>
+          </w:rPr>
+        </w:sdtEndPr>
         <w:sdtContent>
           <w:sdt>
             <w:sdtPr>
-              <w:id w:val="13475077"/>
+              <w:rPr>
+                <w:rFonts w:eastAsia="맑은 고딕" w:hint="eastAsia"/>
+                <w:lang w:eastAsia="ko-KR"/>
+              </w:rPr>
+              <w:id w:val="-1337450215"/>
+              <w:placeholder>
+                <w:docPart w:val="DefaultPlaceholder_-1854013435"/>
+              </w:placeholder>
+              <w15:repeatingSectionItem/>
             </w:sdtPr>
-            <w:sdtEndPr/>
+            <w:sdtEndPr>
+              <w:rPr>
+                <w:rFonts w:eastAsiaTheme="minorEastAsia" w:hint="default"/>
+              </w:rPr>
+            </w:sdtEndPr>
             <w:sdtContent>
               <w:tr>
-                <w:tc>
-                  <w:tcPr>
-                    <w:tcW w:w="3135" w:type="dxa"/>
-                    <w:tcBorders>
-                      <w:top w:val="single" w:sz="4" w:space="0" w:color="B4C7E7"/>
-                      <w:left w:val="single" w:sz="4" w:space="0" w:color="B4C7E7"/>
-                      <w:bottom w:val="single" w:sz="4" w:space="0" w:color="B4C7E7"/>
-                      <w:right w:val="single" w:sz="4" w:space="0" w:color="B4C7E7"/>
-                    </w:tcBorders>
-                    <w:vAlign w:val="center"/>
-                  </w:tcPr>
-                  <w:p>
-                    <w:pPr>
-                      <w:jc w:val="center"/>
-                    </w:pPr>
-                    <w:sdt>
-                      <w:sdtPr>
-                        <w:alias w:val="owner"/>
-                        <w:tag w:val="owner"/>
-                        <w:id w:val="11938667"/>
-                        <w:showingPlcHdr/>
-                        <w:text w:multiLine="1"/>
-                      </w:sdtPr>
-                      <w:sdtEndPr/>
-                      <w:sdtContent>
+                <w:sdt>
+                  <w:sdtPr>
+                    <w:rPr>
+                      <w:rFonts w:eastAsia="맑은 고딕" w:hint="eastAsia"/>
+                      <w:lang w:eastAsia="ko-KR"/>
+                    </w:rPr>
+                    <w:alias w:val="owner"/>
+                    <w:tag w:val="owner"/>
+                    <w:id w:val="702135099"/>
+                    <w:placeholder>
+                      <w:docPart w:val="D8DD3863F4D74B06AC4C98A24CEC316B"/>
+                    </w:placeholder>
+                    <w:showingPlcHdr/>
+                    <w:text/>
+                  </w:sdtPr>
+                  <w:sdtEndPr/>
+                  <w:sdtContent>
+                    <w:tc>
+                      <w:tcPr>
+                        <w:tcW w:w="3135" w:type="dxa"/>
+                        <w:tcBorders>
+                          <w:top w:val="single" w:sz="4" w:space="0" w:color="B4C7E7"/>
+                          <w:left w:val="single" w:sz="4" w:space="0" w:color="B4C7E7"/>
+                          <w:bottom w:val="single" w:sz="4" w:space="0" w:color="B4C7E7"/>
+                          <w:right w:val="single" w:sz="4" w:space="0" w:color="B4C7E7"/>
+                        </w:tcBorders>
+                        <w:vAlign w:val="center"/>
+                      </w:tcPr>
+                      <w:p>
+                        <w:pPr>
+                          <w:jc w:val="center"/>
+                          <w:rPr>
+                            <w:rFonts w:eastAsia="맑은 고딕"/>
+                            <w:lang w:eastAsia="ko-KR"/>
+                          </w:rPr>
+                        </w:pPr>
                         <w:r>
+                          <w:rPr>
+                            <w:rFonts w:eastAsia="맑은 고딕" w:hint="eastAsia"/>
+                            <w:lang w:eastAsia="ko-KR"/>
+                          </w:rPr>
                           <w:t>owner</w:t>
                         </w:r>
-                      </w:sdtContent>
-                    </w:sdt>
-                  </w:p>
-                </w:tc>
-                <w:tc>
-                  <w:tcPr>
-                    <w:tcW w:w="3135" w:type="dxa"/>
-                    <w:tcBorders>
-                      <w:top w:val="single" w:sz="4" w:space="0" w:color="B4C7E7"/>
-                      <w:left w:val="single" w:sz="4" w:space="0" w:color="B4C7E7"/>
-                      <w:bottom w:val="single" w:sz="4" w:space="0" w:color="B4C7E7"/>
-                      <w:right w:val="single" w:sz="4" w:space="0" w:color="B4C7E7"/>
-                    </w:tcBorders>
-                    <w:vAlign w:val="center"/>
-                  </w:tcPr>
-                  <w:p>
-                    <w:pPr>
-                      <w:jc w:val="center"/>
-                    </w:pPr>
-                    <w:sdt>
-                      <w:sdtPr>
-                        <w:alias w:val="dueDate"/>
-                        <w:tag w:val="dueDate"/>
-                        <w:id w:val="10875435"/>
-                        <w:showingPlcHdr/>
-                        <w:text w:multiLine="1"/>
-                      </w:sdtPr>
-                      <w:sdtEndPr/>
-                      <w:sdtContent>
+                      </w:p>
+                    </w:tc>
+                  </w:sdtContent>
+                </w:sdt>
+                <w:sdt>
+                  <w:sdtPr>
+                    <w:rPr>
+                      <w:lang w:eastAsia="ko-KR"/>
+                    </w:rPr>
+                    <w:alias w:val="duedate"/>
+                    <w:tag w:val="duedate"/>
+                    <w:id w:val="-423039153"/>
+                    <w:placeholder>
+                      <w:docPart w:val="B1EA8BA068C145A9B32F16222DCC717F"/>
+                    </w:placeholder>
+                    <w:showingPlcHdr/>
+                    <w:text/>
+                  </w:sdtPr>
+                  <w:sdtContent>
+                    <w:tc>
+                      <w:tcPr>
+                        <w:tcW w:w="3135" w:type="dxa"/>
+                        <w:tcBorders>
+                          <w:top w:val="single" w:sz="4" w:space="0" w:color="B4C7E7"/>
+                          <w:left w:val="single" w:sz="4" w:space="0" w:color="B4C7E7"/>
+                          <w:bottom w:val="single" w:sz="4" w:space="0" w:color="B4C7E7"/>
+                          <w:right w:val="single" w:sz="4" w:space="0" w:color="B4C7E7"/>
+                        </w:tcBorders>
+                        <w:vAlign w:val="center"/>
+                      </w:tcPr>
+                      <w:p>
+                        <w:pPr>
+                          <w:jc w:val="center"/>
+                          <w:rPr>
+                            <w:lang w:eastAsia="ko-KR"/>
+                          </w:rPr>
+                        </w:pPr>
                         <w:r>
-                          <w:t>dueDate</w:t>
+                          <w:rPr>
+                            <w:lang w:eastAsia="ko-KR"/>
+                          </w:rPr>
+                          <w:t>duedate</w:t>
                         </w:r>
-                      </w:sdtContent>
-                    </w:sdt>
-                  </w:p>
-                </w:tc>
-                <w:tc>
-                  <w:tcPr>
-                    <w:tcW w:w="3135" w:type="dxa"/>
-                    <w:tcBorders>
-                      <w:top w:val="single" w:sz="4" w:space="0" w:color="B4C7E7"/>
-                      <w:left w:val="single" w:sz="4" w:space="0" w:color="B4C7E7"/>
-                      <w:bottom w:val="single" w:sz="4" w:space="0" w:color="B4C7E7"/>
-                      <w:right w:val="single" w:sz="4" w:space="0" w:color="B4C7E7"/>
-                    </w:tcBorders>
-                    <w:vAlign w:val="center"/>
-                  </w:tcPr>
-                  <w:p>
-                    <w:sdt>
-                      <w:sdtPr>
-                        <w:alias w:val="task"/>
-                        <w:tag w:val="task"/>
-                        <w:id w:val="84954317"/>
-                        <w:showingPlcHdr/>
-                        <w:text w:multiLine="1"/>
-                      </w:sdtPr>
-                      <w:sdtEndPr/>
-                      <w:sdtContent>
+                      </w:p>
+                    </w:tc>
+                  </w:sdtContent>
+                </w:sdt>
+                <w:sdt>
+                  <w:sdtPr>
+                    <w:rPr>
+                      <w:lang w:eastAsia="ko-KR"/>
+                    </w:rPr>
+                    <w:alias w:val="task"/>
+                    <w:tag w:val="task"/>
+                    <w:id w:val="500321918"/>
+                    <w:placeholder>
+                      <w:docPart w:val="57090CC0E10D444DA4AD60358F6C2F4A"/>
+                    </w:placeholder>
+                    <w:showingPlcHdr/>
+                    <w:text/>
+                  </w:sdtPr>
+                  <w:sdtContent>
+                    <w:tc>
+                      <w:tcPr>
+                        <w:tcW w:w="3135" w:type="dxa"/>
+                        <w:tcBorders>
+                          <w:top w:val="single" w:sz="4" w:space="0" w:color="B4C7E7"/>
+                          <w:left w:val="single" w:sz="4" w:space="0" w:color="B4C7E7"/>
+                          <w:bottom w:val="single" w:sz="4" w:space="0" w:color="B4C7E7"/>
+                          <w:right w:val="single" w:sz="4" w:space="0" w:color="B4C7E7"/>
+                        </w:tcBorders>
+                        <w:vAlign w:val="center"/>
+                      </w:tcPr>
+                      <w:p>
+                        <w:pPr>
+                          <w:rPr>
+                            <w:lang w:eastAsia="ko-KR"/>
+                          </w:rPr>
+                        </w:pPr>
                         <w:r>
+                          <w:rPr>
+                            <w:lang w:eastAsia="ko-KR"/>
+                          </w:rPr>
                           <w:t>task</w:t>
                         </w:r>
-                      </w:sdtContent>
-                    </w:sdt>
-                  </w:p>
-                </w:tc>
+                      </w:p>
+                    </w:tc>
+                  </w:sdtContent>
+                </w:sdt>
               </w:tr>
             </w:sdtContent>
           </w:sdt>
@@ -746,53 +669,7 @@
           <w:color w:val="1F3864"/>
           <w:sz w:val="32"/>
         </w:rPr>
-        <w:lastRenderedPageBreak/>
-        <w:t xml:space="preserve">6. </w:t>
-      </w:r>
-      <w:r>
-        <w:rPr>
-          <w:rFonts w:eastAsia="맑은 고딕"/>
-          <w:b/>
-          <w:color w:val="1F3864"/>
-          <w:sz w:val="32"/>
-        </w:rPr>
-        <w:t>다음</w:t>
-      </w:r>
-      <w:r>
-        <w:rPr>
-          <w:rFonts w:eastAsia="맑은 고딕"/>
-          <w:b/>
-          <w:color w:val="1F3864"/>
-          <w:sz w:val="32"/>
-        </w:rPr>
-        <w:t xml:space="preserve"> </w:t>
-      </w:r>
-      <w:r>
-        <w:rPr>
-          <w:rFonts w:eastAsia="맑은 고딕"/>
-          <w:b/>
-          <w:color w:val="1F3864"/>
-          <w:sz w:val="32"/>
-        </w:rPr>
-        <w:t>회의</w:t>
-      </w:r>
-      <w:r>
-        <w:rPr>
-          <w:rFonts w:eastAsia="맑은 고딕"/>
-          <w:b/>
-          <w:color w:val="1F3864"/>
-          <w:sz w:val="32"/>
-        </w:rPr>
-        <w:t xml:space="preserve"> </w:t>
-      </w:r>
-      <w:r>
-        <w:rPr>
-          <w:rFonts w:eastAsia="맑은 고딕"/>
-          <w:b/>
-          <w:color w:val="1F3864"/>
-          <w:sz w:val="32"/>
-        </w:rPr>
-        <w:t>일정</w:t>
+        <w:t>6. 다음 회의 일정</w:t>
       </w:r>
     </w:p>
     <w:tbl>
@@ -801,7 +678,7 @@
         <w:tblLook w:val="04A0" w:firstRow="1" w:lastRow="0" w:firstColumn="1" w:lastColumn="0" w:noHBand="0" w:noVBand="1"/>
       </w:tblPr>
       <w:tblGrid>
-        <w:gridCol w:w="9406"/>
+        <w:gridCol w:w="9396"/>
       </w:tblGrid>
       <w:tr>
         <w:tc>
@@ -820,10 +697,12 @@
                 <w:alias w:val="nextMeeting"/>
                 <w:tag w:val="nextMeeting"/>
                 <w:id w:val="47551141"/>
+                <w:placeholder>
+                  <w:docPart w:val="826E10410FF74DCBB3A4209682EC2D79"/>
+                </w:placeholder>
                 <w:showingPlcHdr/>
                 <w:text w:multiLine="1"/>
               </w:sdtPr>
-              <w:sdtEndPr/>
               <w:sdtContent>
                 <w:r>
                   <w:t>nextMeeting</w:t>
@@ -12437,7 +12316,912 @@
       </w:tcPr>
     </w:tblStylePr>
   </w:style>
+  <w:style w:type="character" w:styleId="aff1">
+    <w:name w:val="Placeholder Text"/>
+    <w:basedOn w:val="a2"/>
+    <w:uiPriority w:val="99"/>
+    <w:semiHidden/>
+    <w:rsid w:val="009B1A3D"/>
+    <w:rPr>
+      <w:color w:val="666666"/>
+    </w:rPr>
+  </w:style>
 </w:styles>
+</file>
+
+<file path=word/glossary/document.xml><?xml version="1.0" encoding="utf-8"?>
+<w:glossaryDocument xmlns:wpc="http://schemas.microsoft.com/office/word/2010/wordprocessingCanvas" xmlns:cx="http://schemas.microsoft.com/office/drawing/2014/chartex" xmlns:cx1="http://schemas.microsoft.com/office/drawing/2015/9/8/chartex" xmlns:cx2="http://schemas.microsoft.com/office/drawing/2015/10/21/chartex" xmlns:cx3="http://schemas.microsoft.com/office/drawing/2016/5/9/chartex" xmlns:cx4="http://schemas.microsoft.com/office/drawing/2016/5/10/chartex" xmlns:cx5="http://schemas.microsoft.com/office/drawing/2016/5/11/chartex" xmlns:cx6="http://schemas.microsoft.com/office/drawing/2016/5/12/chartex" xmlns:cx7="http://schemas.microsoft.com/office/drawing/2016/5/13/chartex" xmlns:cx8="http://schemas.microsoft.com/office/drawing/2016/5/14/chartex" xmlns:mc="http://schemas.openxmlformats.org/markup-compatibility/2006" xmlns:aink="http://schemas.microsoft.com/office/drawing/2016/ink" xmlns:am3d="http://schemas.microsoft.com/office/drawing/2017/model3d" xmlns:o="urn:schemas-microsoft-com:office:office" xmlns:oel="http://schemas.microsoft.com/office/2019/extlst" xmlns:r="http://schemas.openxmlformats.org/officeDocument/2006/relationships" xmlns:m="http://schemas.openxmlformats.org/officeDocument/2006/math" xmlns:v="urn:schemas-microsoft-com:vml" xmlns:wp14="http://schemas.microsoft.com/office/word/2010/wordprocessingDrawing" xmlns:wp="http://schemas.openxmlformats.org/drawingml/2006/wordprocessingDrawing" xmlns:w10="urn:schemas-microsoft-com:office:word" xmlns:w="http://schemas.openxmlformats.org/wordprocessingml/2006/main" xmlns:w14="http://schemas.microsoft.com/office/word/2010/wordml" xmlns:w15="http://schemas.microsoft.com/office/word/2012/wordml" xmlns:w16cex="http://schemas.microsoft.com/office/word/2018/wordml/cex" xmlns:w16cid="http://schemas.microsoft.com/office/word/2016/wordml/cid" xmlns:w16="http://schemas.microsoft.com/office/word/2018/wordml" xmlns:w16du="http://schemas.microsoft.com/office/word/2023/wordml/word16du" xmlns:w16sdtdh="http://schemas.microsoft.com/office/word/2020/wordml/sdtdatahash" xmlns:w16sdtfl="http://schemas.microsoft.com/office/word/2024/wordml/sdtformatlock" xmlns:w16se="http://schemas.microsoft.com/office/word/2015/wordml/symex" xmlns:wpg="http://schemas.microsoft.com/office/word/2010/wordprocessingGroup" xmlns:wpi="http://schemas.microsoft.com/office/word/2010/wordprocessingInk" xmlns:wne="http://schemas.microsoft.com/office/word/2006/wordml" xmlns:wps="http://schemas.microsoft.com/office/word/2010/wordprocessingShape" mc:Ignorable="w14 w15 w16se w16cid w16 w16cex w16sdtdh w16sdtfl w16du wp14">
+  <w:docParts>
+    <w:docPart>
+      <w:docPartPr>
+        <w:name w:val="107DDFF9D1B94226A246A160F3B26374"/>
+        <w:category>
+          <w:name w:val="일반"/>
+          <w:gallery w:val="placeholder"/>
+        </w:category>
+        <w:types>
+          <w:type w:val="bbPlcHdr"/>
+        </w:types>
+        <w:behaviors>
+          <w:behavior w:val="content"/>
+        </w:behaviors>
+        <w:guid w:val="{3FECBFD7-FF7C-4AEA-A9AA-AFAD31536B68}"/>
+      </w:docPartPr>
+      <w:docPartBody>
+        <w:p>
+          <w:r>
+            <w:t>title</w:t>
+          </w:r>
+        </w:p>
+      </w:docPartBody>
+    </w:docPart>
+    <w:docPart>
+      <w:docPartPr>
+        <w:name w:val="FD2061C14E4C4B6DBF52273A29DE5D26"/>
+        <w:category>
+          <w:name w:val="일반"/>
+          <w:gallery w:val="placeholder"/>
+        </w:category>
+        <w:types>
+          <w:type w:val="bbPlcHdr"/>
+        </w:types>
+        <w:behaviors>
+          <w:behavior w:val="content"/>
+        </w:behaviors>
+        <w:guid w:val="{A7E2ADD8-A781-459D-AF8B-49DE0E49095F}"/>
+      </w:docPartPr>
+      <w:docPartBody>
+        <w:p>
+          <w:r>
+            <w:t>meetingDate</w:t>
+          </w:r>
+        </w:p>
+      </w:docPartBody>
+    </w:docPart>
+    <w:docPart>
+      <w:docPartPr>
+        <w:name w:val="62D005E8D20A4324A27598EAD9372AA1"/>
+        <w:category>
+          <w:name w:val="일반"/>
+          <w:gallery w:val="placeholder"/>
+        </w:category>
+        <w:types>
+          <w:type w:val="bbPlcHdr"/>
+        </w:types>
+        <w:behaviors>
+          <w:behavior w:val="content"/>
+        </w:behaviors>
+        <w:guid w:val="{0841707E-E207-4EA7-9E36-701A331ABF5E}"/>
+      </w:docPartPr>
+      <w:docPartBody>
+        <w:p>
+          <w:r>
+            <w:t>location</w:t>
+          </w:r>
+        </w:p>
+      </w:docPartBody>
+    </w:docPart>
+    <w:docPart>
+      <w:docPartPr>
+        <w:name w:val="1058E08B3A00462C997C044C52636E00"/>
+        <w:category>
+          <w:name w:val="일반"/>
+          <w:gallery w:val="placeholder"/>
+        </w:category>
+        <w:types>
+          <w:type w:val="bbPlcHdr"/>
+        </w:types>
+        <w:behaviors>
+          <w:behavior w:val="content"/>
+        </w:behaviors>
+        <w:guid w:val="{71B0A370-25B0-48DC-B640-71CCC5153481}"/>
+      </w:docPartPr>
+      <w:docPartBody>
+        <w:p>
+          <w:r>
+            <w:t>attendees</w:t>
+          </w:r>
+        </w:p>
+      </w:docPartBody>
+    </w:docPart>
+    <w:docPart>
+      <w:docPartPr>
+        <w:name w:val="C71646578BBD43839A59C323FCEA5693"/>
+        <w:category>
+          <w:name w:val="일반"/>
+          <w:gallery w:val="placeholder"/>
+        </w:category>
+        <w:types>
+          <w:type w:val="bbPlcHdr"/>
+        </w:types>
+        <w:behaviors>
+          <w:behavior w:val="content"/>
+        </w:behaviors>
+        <w:guid w:val="{EBD5E9B1-2F3D-41B2-8D7F-926A447A2B7B}"/>
+      </w:docPartPr>
+      <w:docPartBody>
+        <w:p>
+          <w:r>
+            <w:t>agenda</w:t>
+          </w:r>
+        </w:p>
+      </w:docPartBody>
+    </w:docPart>
+    <w:docPart>
+      <w:docPartPr>
+        <w:name w:val="998CD899639047BBA27F141DA80F0355"/>
+        <w:category>
+          <w:name w:val="일반"/>
+          <w:gallery w:val="placeholder"/>
+        </w:category>
+        <w:types>
+          <w:type w:val="bbPlcHdr"/>
+        </w:types>
+        <w:behaviors>
+          <w:behavior w:val="content"/>
+        </w:behaviors>
+        <w:guid w:val="{37000A97-1BCC-4EF7-9C2D-3B1794C5734E}"/>
+      </w:docPartPr>
+      <w:docPartBody>
+        <w:p>
+          <w:r>
+            <w:t>decisions</w:t>
+          </w:r>
+        </w:p>
+      </w:docPartBody>
+    </w:docPart>
+    <w:docPart>
+      <w:docPartPr>
+        <w:name w:val="D8DD3863F4D74B06AC4C98A24CEC316B"/>
+        <w:category>
+          <w:name w:val="일반"/>
+          <w:gallery w:val="placeholder"/>
+        </w:category>
+        <w:types>
+          <w:type w:val="bbPlcHdr"/>
+        </w:types>
+        <w:behaviors>
+          <w:behavior w:val="content"/>
+        </w:behaviors>
+        <w:guid w:val="{13B15344-1262-483A-B5AF-75A0A9377615}"/>
+      </w:docPartPr>
+      <w:docPartBody>
+        <w:p>
+          <w:pPr>
+            <w:pStyle w:val="D8DD3863F4D74B06AC4C98A24CEC316B"/>
+          </w:pPr>
+          <w:r>
+            <w:rPr>
+              <w:rFonts w:eastAsia="맑은 고딕" w:hint="eastAsia"/>
+              <w:lang w:eastAsia="ko-KR"/>
+            </w:rPr>
+            <w:t>owner</w:t>
+          </w:r>
+        </w:p>
+      </w:docPartBody>
+    </w:docPart>
+    <w:docPart>
+      <w:docPartPr>
+        <w:name w:val="B1EA8BA068C145A9B32F16222DCC717F"/>
+        <w:category>
+          <w:name w:val="일반"/>
+          <w:gallery w:val="placeholder"/>
+        </w:category>
+        <w:types>
+          <w:type w:val="bbPlcHdr"/>
+        </w:types>
+        <w:behaviors>
+          <w:behavior w:val="content"/>
+        </w:behaviors>
+        <w:guid w:val="{8D2A6F54-6EAB-4E34-8E68-0A6377E108B2}"/>
+      </w:docPartPr>
+      <w:docPartBody>
+        <w:p>
+          <w:pPr>
+            <w:pStyle w:val="B1EA8BA068C145A9B32F16222DCC717F"/>
+          </w:pPr>
+          <w:r>
+            <w:rPr>
+              <w:lang w:eastAsia="ko-KR"/>
+            </w:rPr>
+            <w:t>duedate</w:t>
+          </w:r>
+        </w:p>
+      </w:docPartBody>
+    </w:docPart>
+    <w:docPart>
+      <w:docPartPr>
+        <w:name w:val="57090CC0E10D444DA4AD60358F6C2F4A"/>
+        <w:category>
+          <w:name w:val="일반"/>
+          <w:gallery w:val="placeholder"/>
+        </w:category>
+        <w:types>
+          <w:type w:val="bbPlcHdr"/>
+        </w:types>
+        <w:behaviors>
+          <w:behavior w:val="content"/>
+        </w:behaviors>
+        <w:guid w:val="{D8C09EC8-23BF-4422-801A-0858DFD15025}"/>
+      </w:docPartPr>
+      <w:docPartBody>
+        <w:p>
+          <w:pPr>
+            <w:pStyle w:val="57090CC0E10D444DA4AD60358F6C2F4A"/>
+          </w:pPr>
+          <w:r>
+            <w:rPr>
+              <w:lang w:eastAsia="ko-KR"/>
+            </w:rPr>
+            <w:t>task</w:t>
+          </w:r>
+        </w:p>
+      </w:docPartBody>
+    </w:docPart>
+    <w:docPart>
+      <w:docPartPr>
+        <w:name w:val="826E10410FF74DCBB3A4209682EC2D79"/>
+        <w:category>
+          <w:name w:val="일반"/>
+          <w:gallery w:val="placeholder"/>
+        </w:category>
+        <w:types>
+          <w:type w:val="bbPlcHdr"/>
+        </w:types>
+        <w:behaviors>
+          <w:behavior w:val="content"/>
+        </w:behaviors>
+        <w:guid w:val="{26A81901-70A6-4704-82B4-1AFEFC204A37}"/>
+      </w:docPartPr>
+      <w:docPartBody>
+        <w:p>
+          <w:r>
+            <w:t>nextMeeting</w:t>
+          </w:r>
+        </w:p>
+      </w:docPartBody>
+    </w:docPart>
+    <w:docPart>
+      <w:docPartPr>
+        <w:name w:val="DefaultPlaceholder_-1854013435"/>
+        <w:category>
+          <w:name w:val="일반"/>
+          <w:gallery w:val="placeholder"/>
+        </w:category>
+        <w:types>
+          <w:type w:val="bbPlcHdr"/>
+        </w:types>
+        <w:behaviors>
+          <w:behavior w:val="content"/>
+        </w:behaviors>
+        <w:guid w:val="{315F53E8-5E27-4F33-B681-1F5600876C2C}"/>
+      </w:docPartPr>
+      <w:docPartBody>
+        <w:p>
+          <w:r>
+            <w:rPr>
+              <w:rStyle w:val="a3"/>
+            </w:rPr>
+            <w:t>다른 콘텐츠 컨트롤 등 반복하려는 콘텐츠를 입력하세요. 이 컨트롤을 표의 열 주위에 삽입하여 표의 일부를 반복할 수도 있습니다.</w:t>
+          </w:r>
+        </w:p>
+      </w:docPartBody>
+    </w:docPart>
+  </w:docParts>
+</w:glossaryDocument>
+</file>
+
+<file path=word/glossary/fontTable.xml><?xml version="1.0" encoding="utf-8"?>
+<w:fonts xmlns:mc="http://schemas.openxmlformats.org/markup-compatibility/2006" xmlns:r="http://schemas.openxmlformats.org/officeDocument/2006/relationships" xmlns:w="http://schemas.openxmlformats.org/wordprocessingml/2006/main" xmlns:w14="http://schemas.microsoft.com/office/word/2010/wordml" xmlns:w15="http://schemas.microsoft.com/office/word/2012/wordml" xmlns:w16cex="http://schemas.microsoft.com/office/word/2018/wordml/cex" xmlns:w16cid="http://schemas.microsoft.com/office/word/2016/wordml/cid" xmlns:w16="http://schemas.microsoft.com/office/word/2018/wordml" xmlns:w16du="http://schemas.microsoft.com/office/word/2023/wordml/word16du" xmlns:w16sdtdh="http://schemas.microsoft.com/office/word/2020/wordml/sdtdatahash" xmlns:w16sdtfl="http://schemas.microsoft.com/office/word/2024/wordml/sdtformatlock" xmlns:w16se="http://schemas.microsoft.com/office/word/2015/wordml/symex" mc:Ignorable="w14 w15 w16se w16cid w16 w16cex w16sdtdh w16sdtfl w16du">
+  <w:font w:name="Symbol">
+    <w:panose1 w:val="05050102010706020507"/>
+    <w:charset w:val="02"/>
+    <w:family w:val="roman"/>
+    <w:pitch w:val="variable"/>
+    <w:sig w:usb0="00000000" w:usb1="10000000" w:usb2="00000000" w:usb3="00000000" w:csb0="80000000" w:csb1="00000000"/>
+  </w:font>
+  <w:font w:name="Times New Roman">
+    <w:panose1 w:val="02020603050405020304"/>
+    <w:charset w:val="00"/>
+    <w:family w:val="roman"/>
+    <w:pitch w:val="variable"/>
+    <w:sig w:usb0="E0002EFF" w:usb1="C000785B" w:usb2="00000009" w:usb3="00000000" w:csb0="000001FF" w:csb1="00000000"/>
+  </w:font>
+  <w:font w:name="Cambria">
+    <w:panose1 w:val="02040503050406030204"/>
+    <w:charset w:val="00"/>
+    <w:family w:val="roman"/>
+    <w:pitch w:val="variable"/>
+    <w:sig w:usb0="E00006FF" w:usb1="420024FF" w:usb2="02000000" w:usb3="00000000" w:csb0="0000019F" w:csb1="00000000"/>
+  </w:font>
+  <w:font w:name="MS Mincho">
+    <w:panose1 w:val="02020609040205080304"/>
+    <w:charset w:val="80"/>
+    <w:family w:val="modern"/>
+    <w:pitch w:val="fixed"/>
+    <w:sig w:usb0="E00002FF" w:usb1="6AC7FDFB" w:usb2="08000012" w:usb3="00000000" w:csb0="0002009F" w:csb1="00000000"/>
+  </w:font>
+  <w:font w:name="맑은 고딕">
+    <w:panose1 w:val="020B0503020000020004"/>
+    <w:charset w:val="81"/>
+    <w:family w:val="modern"/>
+    <w:pitch w:val="variable"/>
+    <w:sig w:usb0="9000002F" w:usb1="29D77CFB" w:usb2="00000012" w:usb3="00000000" w:csb0="00080001" w:csb1="00000000"/>
+  </w:font>
+  <w:font w:name="Calibri">
+    <w:panose1 w:val="020F0502020204030204"/>
+    <w:charset w:val="00"/>
+    <w:family w:val="swiss"/>
+    <w:pitch w:val="variable"/>
+    <w:sig w:usb0="E4002EFF" w:usb1="C200247B" w:usb2="00000009" w:usb3="00000000" w:csb0="000001FF" w:csb1="00000000"/>
+  </w:font>
+  <w:font w:name="MS Gothic">
+    <w:altName w:val="ＭＳ ゴシック"/>
+    <w:panose1 w:val="020B0609070205080204"/>
+    <w:charset w:val="80"/>
+    <w:family w:val="modern"/>
+    <w:pitch w:val="fixed"/>
+    <w:sig w:usb0="E00002FF" w:usb1="6AC7FDFB" w:usb2="08000012" w:usb3="00000000" w:csb0="0002009F" w:csb1="00000000"/>
+  </w:font>
+  <w:font w:name="Courier">
+    <w:panose1 w:val="02070409020205020404"/>
+    <w:charset w:val="00"/>
+    <w:family w:val="auto"/>
+    <w:pitch w:val="variable"/>
+    <w:sig w:usb0="00000003" w:usb1="00000000" w:usb2="00000000" w:usb3="00000000" w:csb0="00000001" w:csb1="00000000"/>
+  </w:font>
+</w:fonts>
+</file>
+
+<file path=word/glossary/settings.xml><?xml version="1.0" encoding="utf-8"?>
+<w:settings xmlns:mc="http://schemas.openxmlformats.org/markup-compatibility/2006" xmlns:o="urn:schemas-microsoft-com:office:office" xmlns:r="http://schemas.openxmlformats.org/officeDocument/2006/relationships" xmlns:m="http://schemas.openxmlformats.org/officeDocument/2006/math" xmlns:v="urn:schemas-microsoft-com:vml" xmlns:w10="urn:schemas-microsoft-com:office:word" xmlns:w="http://schemas.openxmlformats.org/wordprocessingml/2006/main" xmlns:w14="http://schemas.microsoft.com/office/word/2010/wordml" xmlns:w15="http://schemas.microsoft.com/office/word/2012/wordml" xmlns:w16cex="http://schemas.microsoft.com/office/word/2018/wordml/cex" xmlns:w16cid="http://schemas.microsoft.com/office/word/2016/wordml/cid" xmlns:w16="http://schemas.microsoft.com/office/word/2018/wordml" xmlns:w16du="http://schemas.microsoft.com/office/word/2023/wordml/word16du" xmlns:w16sdtdh="http://schemas.microsoft.com/office/word/2020/wordml/sdtdatahash" xmlns:w16sdtfl="http://schemas.microsoft.com/office/word/2024/wordml/sdtformatlock" xmlns:w16se="http://schemas.microsoft.com/office/word/2015/wordml/symex" xmlns:sl="http://schemas.openxmlformats.org/schemaLibrary/2006/main" mc:Ignorable="w14 w15 w16se w16cid w16 w16cex w16sdtdh w16sdtfl w16du">
+  <w:view w:val="normal"/>
+  <w:bordersDoNotSurroundHeader/>
+  <w:bordersDoNotSurroundFooter/>
+  <w:defaultTabStop w:val="800"/>
+  <w:displayHorizontalDrawingGridEvery w:val="0"/>
+  <w:displayVerticalDrawingGridEvery w:val="2"/>
+  <w:noPunctuationKerning/>
+  <w:characterSpacingControl w:val="doNotCompress"/>
+  <w:compat>
+    <w:spaceForUL/>
+    <w:balanceSingleByteDoubleByteWidth/>
+    <w:doNotLeaveBackslashAlone/>
+    <w:ulTrailSpace/>
+    <w:doNotExpandShiftReturn/>
+    <w:adjustLineHeightInTable/>
+    <w:useFELayout/>
+    <w:compatSetting w:name="compatibilityMode" w:uri="http://schemas.microsoft.com/office/word" w:val="15"/>
+    <w:compatSetting w:name="overrideTableStyleFontSizeAndJustification" w:uri="http://schemas.microsoft.com/office/word" w:val="1"/>
+    <w:compatSetting w:name="enableOpenTypeFeatures" w:uri="http://schemas.microsoft.com/office/word" w:val="1"/>
+    <w:compatSetting w:name="doNotFlipMirrorIndents" w:uri="http://schemas.microsoft.com/office/word" w:val="1"/>
+    <w:compatSetting w:name="differentiateMultirowTableHeaders" w:uri="http://schemas.microsoft.com/office/word" w:val="1"/>
+    <w:compatSetting w:name="useWord2013TrackBottomHyphenation" w:uri="http://schemas.microsoft.com/office/word" w:val="0"/>
+  </w:compat>
+  <w:rsids>
+    <w:rsidRoot w:val="00D44B8F"/>
+    <w:rsid w:val="006B3D89"/>
+    <w:rsid w:val="006C3D3E"/>
+    <w:rsid w:val="00714869"/>
+    <w:rsid w:val="00C45F15"/>
+    <w:rsid w:val="00D44B8F"/>
+    <w:rsid w:val="00DF1A34"/>
+  </w:rsids>
+  <m:mathPr>
+    <m:mathFont m:val="Cambria Math"/>
+    <m:brkBin m:val="before"/>
+    <m:brkBinSub m:val="--"/>
+    <m:smallFrac m:val="0"/>
+    <m:dispDef/>
+    <m:lMargin m:val="0"/>
+    <m:rMargin m:val="0"/>
+    <m:defJc m:val="centerGroup"/>
+    <m:wrapIndent m:val="1440"/>
+    <m:intLim m:val="subSup"/>
+    <m:naryLim m:val="undOvr"/>
+  </m:mathPr>
+  <w:themeFontLang w:val="en-US" w:eastAsia="ko-KR"/>
+  <w:clrSchemeMapping w:bg1="light1" w:t1="dark1" w:bg2="light2" w:t2="dark2" w:accent1="accent1" w:accent2="accent2" w:accent3="accent3" w:accent4="accent4" w:accent5="accent5" w:accent6="accent6" w:hyperlink="hyperlink" w:followedHyperlink="followedHyperlink"/>
+  <w:decimalSymbol w:val="."/>
+  <w:listSeparator w:val=","/>
+  <w15:chartTrackingRefBased/>
+</w:settings>
+</file>
+
+<file path=word/glossary/styles.xml><?xml version="1.0" encoding="utf-8"?>
+<w:styles xmlns:mc="http://schemas.openxmlformats.org/markup-compatibility/2006" xmlns:r="http://schemas.openxmlformats.org/officeDocument/2006/relationships" xmlns:w="http://schemas.openxmlformats.org/wordprocessingml/2006/main" xmlns:w14="http://schemas.microsoft.com/office/word/2010/wordml" xmlns:w15="http://schemas.microsoft.com/office/word/2012/wordml" xmlns:w16cex="http://schemas.microsoft.com/office/word/2018/wordml/cex" xmlns:w16cid="http://schemas.microsoft.com/office/word/2016/wordml/cid" xmlns:w16="http://schemas.microsoft.com/office/word/2018/wordml" xmlns:w16du="http://schemas.microsoft.com/office/word/2023/wordml/word16du" xmlns:w16sdtdh="http://schemas.microsoft.com/office/word/2020/wordml/sdtdatahash" xmlns:w16sdtfl="http://schemas.microsoft.com/office/word/2024/wordml/sdtformatlock" xmlns:w16se="http://schemas.microsoft.com/office/word/2015/wordml/symex" mc:Ignorable="w14 w15 w16se w16cid w16 w16cex w16sdtdh w16sdtfl w16du">
+  <w:docDefaults>
+    <w:rPrDefault>
+      <w:rPr>
+        <w:rFonts w:asciiTheme="minorHAnsi" w:eastAsiaTheme="minorEastAsia" w:hAnsiTheme="minorHAnsi" w:cstheme="minorBidi"/>
+        <w:kern w:val="2"/>
+        <w:sz w:val="22"/>
+        <w:szCs w:val="24"/>
+        <w:lang w:val="en-US" w:eastAsia="ko-KR" w:bidi="ar-SA"/>
+        <w14:ligatures w14:val="standardContextual"/>
+      </w:rPr>
+    </w:rPrDefault>
+    <w:pPrDefault>
+      <w:pPr>
+        <w:spacing w:after="160"/>
+      </w:pPr>
+    </w:pPrDefault>
+  </w:docDefaults>
+  <w:latentStyles w:defLockedState="0" w:defUIPriority="99" w:defSemiHidden="0" w:defUnhideWhenUsed="0" w:defQFormat="0" w:count="376">
+    <w:lsdException w:name="Normal" w:uiPriority="0" w:qFormat="1"/>
+    <w:lsdException w:name="heading 1" w:uiPriority="9" w:qFormat="1"/>
+    <w:lsdException w:name="heading 2" w:semiHidden="1" w:uiPriority="9" w:unhideWhenUsed="1" w:qFormat="1"/>
+    <w:lsdException w:name="heading 3" w:semiHidden="1" w:uiPriority="9" w:unhideWhenUsed="1" w:qFormat="1"/>
+    <w:lsdException w:name="heading 4" w:semiHidden="1" w:uiPriority="9" w:unhideWhenUsed="1" w:qFormat="1"/>
+    <w:lsdException w:name="heading 5" w:semiHidden="1" w:uiPriority="9" w:unhideWhenUsed="1" w:qFormat="1"/>
+    <w:lsdException w:name="heading 6" w:semiHidden="1" w:uiPriority="9" w:unhideWhenUsed="1" w:qFormat="1"/>
+    <w:lsdException w:name="heading 7" w:semiHidden="1" w:uiPriority="9" w:unhideWhenUsed="1" w:qFormat="1"/>
+    <w:lsdException w:name="heading 8" w:semiHidden="1" w:uiPriority="9" w:unhideWhenUsed="1" w:qFormat="1"/>
+    <w:lsdException w:name="heading 9" w:semiHidden="1" w:uiPriority="9" w:unhideWhenUsed="1" w:qFormat="1"/>
+    <w:lsdException w:name="index 1" w:semiHidden="1" w:unhideWhenUsed="1"/>
+    <w:lsdException w:name="index 2" w:semiHidden="1" w:unhideWhenUsed="1"/>
+    <w:lsdException w:name="index 3" w:semiHidden="1" w:unhideWhenUsed="1"/>
+    <w:lsdException w:name="index 4" w:semiHidden="1" w:unhideWhenUsed="1"/>
+    <w:lsdException w:name="index 5" w:semiHidden="1" w:unhideWhenUsed="1"/>
+    <w:lsdException w:name="index 6" w:semiHidden="1" w:unhideWhenUsed="1"/>
+    <w:lsdException w:name="index 7" w:semiHidden="1" w:unhideWhenUsed="1"/>
+    <w:lsdException w:name="index 8" w:semiHidden="1" w:unhideWhenUsed="1"/>
+    <w:lsdException w:name="index 9" w:semiHidden="1" w:unhideWhenUsed="1"/>
+    <w:lsdException w:name="toc 1" w:semiHidden="1" w:uiPriority="39" w:unhideWhenUsed="1"/>
+    <w:lsdException w:name="toc 2" w:semiHidden="1" w:uiPriority="39" w:unhideWhenUsed="1"/>
+    <w:lsdException w:name="toc 3" w:semiHidden="1" w:uiPriority="39" w:unhideWhenUsed="1"/>
+    <w:lsdException w:name="toc 4" w:semiHidden="1" w:uiPriority="39" w:unhideWhenUsed="1"/>
+    <w:lsdException w:name="toc 5" w:semiHidden="1" w:uiPriority="39" w:unhideWhenUsed="1"/>
+    <w:lsdException w:name="toc 6" w:semiHidden="1" w:uiPriority="39" w:unhideWhenUsed="1"/>
+    <w:lsdException w:name="toc 7" w:semiHidden="1" w:uiPriority="39" w:unhideWhenUsed="1"/>
+    <w:lsdException w:name="toc 8" w:semiHidden="1" w:uiPriority="39" w:unhideWhenUsed="1"/>
+    <w:lsdException w:name="toc 9" w:semiHidden="1" w:uiPriority="39" w:unhideWhenUsed="1"/>
+    <w:lsdException w:name="Normal Indent" w:semiHidden="1" w:unhideWhenUsed="1"/>
+    <w:lsdException w:name="footnote text" w:semiHidden="1" w:unhideWhenUsed="1"/>
+    <w:lsdException w:name="annotation text" w:semiHidden="1" w:unhideWhenUsed="1"/>
+    <w:lsdException w:name="header" w:semiHidden="1" w:unhideWhenUsed="1"/>
+    <w:lsdException w:name="footer" w:semiHidden="1" w:unhideWhenUsed="1"/>
+    <w:lsdException w:name="index heading" w:semiHidden="1" w:unhideWhenUsed="1"/>
+    <w:lsdException w:name="caption" w:semiHidden="1" w:uiPriority="35" w:unhideWhenUsed="1" w:qFormat="1"/>
+    <w:lsdException w:name="table of figures" w:semiHidden="1" w:unhideWhenUsed="1"/>
+    <w:lsdException w:name="envelope address" w:semiHidden="1" w:unhideWhenUsed="1"/>
+    <w:lsdException w:name="envelope return" w:semiHidden="1" w:unhideWhenUsed="1"/>
+    <w:lsdException w:name="footnote reference" w:semiHidden="1" w:unhideWhenUsed="1"/>
+    <w:lsdException w:name="annotation reference" w:semiHidden="1" w:unhideWhenUsed="1"/>
+    <w:lsdException w:name="line number" w:semiHidden="1" w:unhideWhenUsed="1"/>
+    <w:lsdException w:name="page number" w:semiHidden="1" w:unhideWhenUsed="1"/>
+    <w:lsdException w:name="endnote reference" w:semiHidden="1" w:unhideWhenUsed="1"/>
+    <w:lsdException w:name="endnote text" w:semiHidden="1" w:unhideWhenUsed="1"/>
+    <w:lsdException w:name="table of authorities" w:semiHidden="1" w:unhideWhenUsed="1"/>
+    <w:lsdException w:name="macro" w:semiHidden="1" w:unhideWhenUsed="1"/>
+    <w:lsdException w:name="toa heading" w:semiHidden="1" w:unhideWhenUsed="1"/>
+    <w:lsdException w:name="List" w:semiHidden="1" w:unhideWhenUsed="1"/>
+    <w:lsdException w:name="List Bullet" w:semiHidden="1" w:unhideWhenUsed="1"/>
+    <w:lsdException w:name="List Number" w:semiHidden="1" w:unhideWhenUsed="1"/>
+    <w:lsdException w:name="List 2" w:semiHidden="1" w:unhideWhenUsed="1"/>
+    <w:lsdException w:name="List 3" w:semiHidden="1" w:unhideWhenUsed="1"/>
+    <w:lsdException w:name="List 4" w:semiHidden="1" w:unhideWhenUsed="1"/>
+    <w:lsdException w:name="List 5" w:semiHidden="1" w:unhideWhenUsed="1"/>
+    <w:lsdException w:name="List Bullet 2" w:semiHidden="1" w:unhideWhenUsed="1"/>
+    <w:lsdException w:name="List Bullet 3" w:semiHidden="1" w:unhideWhenUsed="1"/>
+    <w:lsdException w:name="List Bullet 4" w:semiHidden="1" w:unhideWhenUsed="1"/>
+    <w:lsdException w:name="List Bullet 5" w:semiHidden="1" w:unhideWhenUsed="1"/>
+    <w:lsdException w:name="List Number 2" w:semiHidden="1" w:unhideWhenUsed="1"/>
+    <w:lsdException w:name="List Number 3" w:semiHidden="1" w:unhideWhenUsed="1"/>
+    <w:lsdException w:name="List Number 4" w:semiHidden="1" w:unhideWhenUsed="1"/>
+    <w:lsdException w:name="List Number 5" w:semiHidden="1" w:unhideWhenUsed="1"/>
+    <w:lsdException w:name="Title" w:uiPriority="10" w:qFormat="1"/>
+    <w:lsdException w:name="Closing" w:semiHidden="1" w:unhideWhenUsed="1"/>
+    <w:lsdException w:name="Signature" w:semiHidden="1" w:unhideWhenUsed="1"/>
+    <w:lsdException w:name="Default Paragraph Font" w:semiHidden="1" w:uiPriority="1" w:unhideWhenUsed="1"/>
+    <w:lsdException w:name="Body Text" w:semiHidden="1" w:unhideWhenUsed="1"/>
+    <w:lsdException w:name="Body Text Indent" w:semiHidden="1" w:unhideWhenUsed="1"/>
+    <w:lsdException w:name="List Continue" w:semiHidden="1" w:unhideWhenUsed="1"/>
+    <w:lsdException w:name="List Continue 2" w:semiHidden="1" w:unhideWhenUsed="1"/>
+    <w:lsdException w:name="List Continue 3" w:semiHidden="1" w:unhideWhenUsed="1"/>
+    <w:lsdException w:name="List Continue 4" w:semiHidden="1" w:unhideWhenUsed="1"/>
+    <w:lsdException w:name="List Continue 5" w:semiHidden="1" w:unhideWhenUsed="1"/>
+    <w:lsdException w:name="Message Header" w:semiHidden="1" w:unhideWhenUsed="1"/>
+    <w:lsdException w:name="Subtitle" w:uiPriority="11" w:qFormat="1"/>
+    <w:lsdException w:name="Salutation" w:semiHidden="1" w:unhideWhenUsed="1"/>
+    <w:lsdException w:name="Date" w:semiHidden="1" w:unhideWhenUsed="1"/>
+    <w:lsdException w:name="Body Text First Indent" w:semiHidden="1" w:unhideWhenUsed="1"/>
+    <w:lsdException w:name="Body Text First Indent 2" w:semiHidden="1" w:unhideWhenUsed="1"/>
+    <w:lsdException w:name="Note Heading" w:semiHidden="1" w:unhideWhenUsed="1"/>
+    <w:lsdException w:name="Body Text 2" w:semiHidden="1" w:unhideWhenUsed="1"/>
+    <w:lsdException w:name="Body Text 3" w:semiHidden="1" w:unhideWhenUsed="1"/>
+    <w:lsdException w:name="Body Text Indent 2" w:semiHidden="1" w:unhideWhenUsed="1"/>
+    <w:lsdException w:name="Body Text Indent 3" w:semiHidden="1" w:unhideWhenUsed="1"/>
+    <w:lsdException w:name="Block Text" w:semiHidden="1" w:unhideWhenUsed="1"/>
+    <w:lsdException w:name="Hyperlink" w:semiHidden="1" w:unhideWhenUsed="1"/>
+    <w:lsdException w:name="FollowedHyperlink" w:semiHidden="1" w:unhideWhenUsed="1"/>
+    <w:lsdException w:name="Strong" w:uiPriority="22" w:qFormat="1"/>
+    <w:lsdException w:name="Emphasis" w:uiPriority="20" w:qFormat="1"/>
+    <w:lsdException w:name="Document Map" w:semiHidden="1" w:unhideWhenUsed="1"/>
+    <w:lsdException w:name="Plain Text" w:semiHidden="1" w:unhideWhenUsed="1"/>
+    <w:lsdException w:name="E-mail Signature" w:semiHidden="1" w:unhideWhenUsed="1"/>
+    <w:lsdException w:name="HTML Top of Form" w:semiHidden="1" w:unhideWhenUsed="1"/>
+    <w:lsdException w:name="HTML Bottom of Form" w:semiHidden="1" w:unhideWhenUsed="1"/>
+    <w:lsdException w:name="Normal (Web)" w:semiHidden="1" w:unhideWhenUsed="1"/>
+    <w:lsdException w:name="HTML Acronym" w:semiHidden="1" w:unhideWhenUsed="1"/>
+    <w:lsdException w:name="HTML Address" w:semiHidden="1" w:unhideWhenUsed="1"/>
+    <w:lsdException w:name="HTML Cite" w:semiHidden="1" w:unhideWhenUsed="1"/>
+    <w:lsdException w:name="HTML Code" w:semiHidden="1" w:unhideWhenUsed="1"/>
+    <w:lsdException w:name="HTML Definition" w:semiHidden="1" w:unhideWhenUsed="1"/>
+    <w:lsdException w:name="HTML Keyboard" w:semiHidden="1" w:unhideWhenUsed="1"/>
+    <w:lsdException w:name="HTML Preformatted" w:semiHidden="1" w:unhideWhenUsed="1"/>
+    <w:lsdException w:name="HTML Sample" w:semiHidden="1" w:unhideWhenUsed="1"/>
+    <w:lsdException w:name="HTML Typewriter" w:semiHidden="1" w:unhideWhenUsed="1"/>
+    <w:lsdException w:name="HTML Variable" w:semiHidden="1" w:unhideWhenUsed="1"/>
+    <w:lsdException w:name="Normal Table" w:semiHidden="1" w:unhideWhenUsed="1"/>
+    <w:lsdException w:name="annotation subject" w:semiHidden="1" w:unhideWhenUsed="1"/>
+    <w:lsdException w:name="No List" w:semiHidden="1" w:unhideWhenUsed="1"/>
+    <w:lsdException w:name="Outline List 1" w:semiHidden="1" w:unhideWhenUsed="1"/>
+    <w:lsdException w:name="Outline List 2" w:semiHidden="1" w:unhideWhenUsed="1"/>
+    <w:lsdException w:name="Outline List 3" w:semiHidden="1" w:unhideWhenUsed="1"/>
+    <w:lsdException w:name="Table Simple 1" w:semiHidden="1" w:unhideWhenUsed="1"/>
+    <w:lsdException w:name="Table Simple 2" w:semiHidden="1" w:unhideWhenUsed="1"/>
+    <w:lsdException w:name="Table Simple 3" w:semiHidden="1" w:unhideWhenUsed="1"/>
+    <w:lsdException w:name="Table Classic 1" w:semiHidden="1" w:unhideWhenUsed="1"/>
+    <w:lsdException w:name="Table Classic 2" w:semiHidden="1" w:unhideWhenUsed="1"/>
+    <w:lsdException w:name="Table Classic 3" w:semiHidden="1" w:unhideWhenUsed="1"/>
+    <w:lsdException w:name="Table Classic 4" w:semiHidden="1" w:unhideWhenUsed="1"/>
+    <w:lsdException w:name="Table Colorful 1" w:semiHidden="1" w:unhideWhenUsed="1"/>
+    <w:lsdException w:name="Table Colorful 2" w:semiHidden="1" w:unhideWhenUsed="1"/>
+    <w:lsdException w:name="Table Colorful 3" w:semiHidden="1" w:unhideWhenUsed="1"/>
+    <w:lsdException w:name="Table Columns 1" w:semiHidden="1" w:unhideWhenUsed="1"/>
+    <w:lsdException w:name="Table Columns 2" w:semiHidden="1" w:unhideWhenUsed="1"/>
+    <w:lsdException w:name="Table Columns 3" w:semiHidden="1" w:unhideWhenUsed="1"/>
+    <w:lsdException w:name="Table Columns 4" w:semiHidden="1" w:unhideWhenUsed="1"/>
+    <w:lsdException w:name="Table Columns 5" w:semiHidden="1" w:unhideWhenUsed="1"/>
+    <w:lsdException w:name="Table Grid 1" w:semiHidden="1" w:unhideWhenUsed="1"/>
+    <w:lsdException w:name="Table Grid 2" w:semiHidden="1" w:unhideWhenUsed="1"/>
+    <w:lsdException w:name="Table Grid 3" w:semiHidden="1" w:unhideWhenUsed="1"/>
+    <w:lsdException w:name="Table Grid 4" w:semiHidden="1" w:unhideWhenUsed="1"/>
+    <w:lsdException w:name="Table Grid 5" w:semiHidden="1" w:unhideWhenUsed="1"/>
+    <w:lsdException w:name="Table Grid 6" w:semiHidden="1" w:unhideWhenUsed="1"/>
+    <w:lsdException w:name="Table Grid 7" w:semiHidden="1" w:unhideWhenUsed="1"/>
+    <w:lsdException w:name="Table Grid 8" w:semiHidden="1" w:unhideWhenUsed="1"/>
+    <w:lsdException w:name="Table List 1" w:semiHidden="1" w:unhideWhenUsed="1"/>
+    <w:lsdException w:name="Table List 2" w:semiHidden="1" w:unhideWhenUsed="1"/>
+    <w:lsdException w:name="Table List 3" w:semiHidden="1" w:unhideWhenUsed="1"/>
+    <w:lsdException w:name="Table List 4" w:semiHidden="1" w:unhideWhenUsed="1"/>
+    <w:lsdException w:name="Table List 5" w:semiHidden="1" w:unhideWhenUsed="1"/>
+    <w:lsdException w:name="Table List 6" w:semiHidden="1" w:unhideWhenUsed="1"/>
+    <w:lsdException w:name="Table List 7" w:semiHidden="1" w:unhideWhenUsed="1"/>
+    <w:lsdException w:name="Table List 8" w:semiHidden="1" w:unhideWhenUsed="1"/>
+    <w:lsdException w:name="Table 3D effects 1" w:semiHidden="1" w:unhideWhenUsed="1"/>
+    <w:lsdException w:name="Table 3D effects 2" w:semiHidden="1" w:unhideWhenUsed="1"/>
+    <w:lsdException w:name="Table 3D effects 3" w:semiHidden="1" w:unhideWhenUsed="1"/>
+    <w:lsdException w:name="Table Contemporary" w:semiHidden="1" w:unhideWhenUsed="1"/>
+    <w:lsdException w:name="Table Elegant" w:semiHidden="1" w:unhideWhenUsed="1"/>
+    <w:lsdException w:name="Table Professional" w:semiHidden="1" w:unhideWhenUsed="1"/>
+    <w:lsdException w:name="Table Subtle 1" w:semiHidden="1" w:unhideWhenUsed="1"/>
+    <w:lsdException w:name="Table Subtle 2" w:semiHidden="1" w:unhideWhenUsed="1"/>
+    <w:lsdException w:name="Table Web 1" w:semiHidden="1" w:unhideWhenUsed="1"/>
+    <w:lsdException w:name="Table Web 2" w:semiHidden="1" w:unhideWhenUsed="1"/>
+    <w:lsdException w:name="Table Web 3" w:semiHidden="1" w:unhideWhenUsed="1"/>
+    <w:lsdException w:name="Balloon Text" w:semiHidden="1" w:unhideWhenUsed="1"/>
+    <w:lsdException w:name="Table Grid" w:uiPriority="39"/>
+    <w:lsdException w:name="Table Theme" w:semiHidden="1" w:unhideWhenUsed="1"/>
+    <w:lsdException w:name="Placeholder Text" w:semiHidden="1"/>
+    <w:lsdException w:name="No Spacing" w:uiPriority="1" w:qFormat="1"/>
+    <w:lsdException w:name="Light Shading" w:uiPriority="60"/>
+    <w:lsdException w:name="Light List" w:uiPriority="61"/>
+    <w:lsdException w:name="Light Grid" w:uiPriority="62"/>
+    <w:lsdException w:name="Medium Shading 1" w:uiPriority="63"/>
+    <w:lsdException w:name="Medium Shading 2" w:uiPriority="64"/>
+    <w:lsdException w:name="Medium List 1" w:uiPriority="65"/>
+    <w:lsdException w:name="Medium List 2" w:uiPriority="66"/>
+    <w:lsdException w:name="Medium Grid 1" w:uiPriority="67"/>
+    <w:lsdException w:name="Medium Grid 2" w:uiPriority="68"/>
+    <w:lsdException w:name="Medium Grid 3" w:uiPriority="69"/>
+    <w:lsdException w:name="Dark List" w:uiPriority="70"/>
+    <w:lsdException w:name="Colorful Shading" w:uiPriority="71"/>
+    <w:lsdException w:name="Colorful List" w:uiPriority="72"/>
+    <w:lsdException w:name="Colorful Grid" w:uiPriority="73"/>
+    <w:lsdException w:name="Light Shading Accent 1" w:uiPriority="60"/>
+    <w:lsdException w:name="Light List Accent 1" w:uiPriority="61"/>
+    <w:lsdException w:name="Light Grid Accent 1" w:uiPriority="62"/>
+    <w:lsdException w:name="Medium Shading 1 Accent 1" w:uiPriority="63"/>
+    <w:lsdException w:name="Medium Shading 2 Accent 1" w:uiPriority="64"/>
+    <w:lsdException w:name="Medium List 1 Accent 1" w:uiPriority="65"/>
+    <w:lsdException w:name="Revision" w:semiHidden="1"/>
+    <w:lsdException w:name="List Paragraph" w:uiPriority="34" w:qFormat="1"/>
+    <w:lsdException w:name="Quote" w:uiPriority="29" w:qFormat="1"/>
+    <w:lsdException w:name="Intense Quote" w:uiPriority="30" w:qFormat="1"/>
+    <w:lsdException w:name="Medium List 2 Accent 1" w:uiPriority="66"/>
+    <w:lsdException w:name="Medium Grid 1 Accent 1" w:uiPriority="67"/>
+    <w:lsdException w:name="Medium Grid 2 Accent 1" w:uiPriority="68"/>
+    <w:lsdException w:name="Medium Grid 3 Accent 1" w:uiPriority="69"/>
+    <w:lsdException w:name="Dark List Accent 1" w:uiPriority="70"/>
+    <w:lsdException w:name="Colorful Shading Accent 1" w:uiPriority="71"/>
+    <w:lsdException w:name="Colorful List Accent 1" w:uiPriority="72"/>
+    <w:lsdException w:name="Colorful Grid Accent 1" w:uiPriority="73"/>
+    <w:lsdException w:name="Light Shading Accent 2" w:uiPriority="60"/>
+    <w:lsdException w:name="Light List Accent 2" w:uiPriority="61"/>
+    <w:lsdException w:name="Light Grid Accent 2" w:uiPriority="62"/>
+    <w:lsdException w:name="Medium Shading 1 Accent 2" w:uiPriority="63"/>
+    <w:lsdException w:name="Medium Shading 2 Accent 2" w:uiPriority="64"/>
+    <w:lsdException w:name="Medium List 1 Accent 2" w:uiPriority="65"/>
+    <w:lsdException w:name="Medium List 2 Accent 2" w:uiPriority="66"/>
+    <w:lsdException w:name="Medium Grid 1 Accent 2" w:uiPriority="67"/>
+    <w:lsdException w:name="Medium Grid 2 Accent 2" w:uiPriority="68"/>
+    <w:lsdException w:name="Medium Grid 3 Accent 2" w:uiPriority="69"/>
+    <w:lsdException w:name="Dark List Accent 2" w:uiPriority="70"/>
+    <w:lsdException w:name="Colorful Shading Accent 2" w:uiPriority="71"/>
+    <w:lsdException w:name="Colorful List Accent 2" w:uiPriority="72"/>
+    <w:lsdException w:name="Colorful Grid Accent 2" w:uiPriority="73"/>
+    <w:lsdException w:name="Light Shading Accent 3" w:uiPriority="60"/>
+    <w:lsdException w:name="Light List Accent 3" w:uiPriority="61"/>
+    <w:lsdException w:name="Light Grid Accent 3" w:uiPriority="62"/>
+    <w:lsdException w:name="Medium Shading 1 Accent 3" w:uiPriority="63"/>
+    <w:lsdException w:name="Medium Shading 2 Accent 3" w:uiPriority="64"/>
+    <w:lsdException w:name="Medium List 1 Accent 3" w:uiPriority="65"/>
+    <w:lsdException w:name="Medium List 2 Accent 3" w:uiPriority="66"/>
+    <w:lsdException w:name="Medium Grid 1 Accent 3" w:uiPriority="67"/>
+    <w:lsdException w:name="Medium Grid 2 Accent 3" w:uiPriority="68"/>
+    <w:lsdException w:name="Medium Grid 3 Accent 3" w:uiPriority="69"/>
+    <w:lsdException w:name="Dark List Accent 3" w:uiPriority="70"/>
+    <w:lsdException w:name="Colorful Shading Accent 3" w:uiPriority="71"/>
+    <w:lsdException w:name="Colorful List Accent 3" w:uiPriority="72"/>
+    <w:lsdException w:name="Colorful Grid Accent 3" w:uiPriority="73"/>
+    <w:lsdException w:name="Light Shading Accent 4" w:uiPriority="60"/>
+    <w:lsdException w:name="Light List Accent 4" w:uiPriority="61"/>
+    <w:lsdException w:name="Light Grid Accent 4" w:uiPriority="62"/>
+    <w:lsdException w:name="Medium Shading 1 Accent 4" w:uiPriority="63"/>
+    <w:lsdException w:name="Medium Shading 2 Accent 4" w:uiPriority="64"/>
+    <w:lsdException w:name="Medium List 1 Accent 4" w:uiPriority="65"/>
+    <w:lsdException w:name="Medium List 2 Accent 4" w:uiPriority="66"/>
+    <w:lsdException w:name="Medium Grid 1 Accent 4" w:uiPriority="67"/>
+    <w:lsdException w:name="Medium Grid 2 Accent 4" w:uiPriority="68"/>
+    <w:lsdException w:name="Medium Grid 3 Accent 4" w:uiPriority="69"/>
+    <w:lsdException w:name="Dark List Accent 4" w:uiPriority="70"/>
+    <w:lsdException w:name="Colorful Shading Accent 4" w:uiPriority="71"/>
+    <w:lsdException w:name="Colorful List Accent 4" w:uiPriority="72"/>
+    <w:lsdException w:name="Colorful Grid Accent 4" w:uiPriority="73"/>
+    <w:lsdException w:name="Light Shading Accent 5" w:uiPriority="60"/>
+    <w:lsdException w:name="Light List Accent 5" w:uiPriority="61"/>
+    <w:lsdException w:name="Light Grid Accent 5" w:uiPriority="62"/>
+    <w:lsdException w:name="Medium Shading 1 Accent 5" w:uiPriority="63"/>
+    <w:lsdException w:name="Medium Shading 2 Accent 5" w:uiPriority="64"/>
+    <w:lsdException w:name="Medium List 1 Accent 5" w:uiPriority="65"/>
+    <w:lsdException w:name="Medium List 2 Accent 5" w:uiPriority="66"/>
+    <w:lsdException w:name="Medium Grid 1 Accent 5" w:uiPriority="67"/>
+    <w:lsdException w:name="Medium Grid 2 Accent 5" w:uiPriority="68"/>
+    <w:lsdException w:name="Medium Grid 3 Accent 5" w:uiPriority="69"/>
+    <w:lsdException w:name="Dark List Accent 5" w:uiPriority="70"/>
+    <w:lsdException w:name="Colorful Shading Accent 5" w:uiPriority="71"/>
+    <w:lsdException w:name="Colorful List Accent 5" w:uiPriority="72"/>
+    <w:lsdException w:name="Colorful Grid Accent 5" w:uiPriority="73"/>
+    <w:lsdException w:name="Light Shading Accent 6" w:uiPriority="60"/>
+    <w:lsdException w:name="Light List Accent 6" w:uiPriority="61"/>
+    <w:lsdException w:name="Light Grid Accent 6" w:uiPriority="62"/>
+    <w:lsdException w:name="Medium Shading 1 Accent 6" w:uiPriority="63"/>
+    <w:lsdException w:name="Medium Shading 2 Accent 6" w:uiPriority="64"/>
+    <w:lsdException w:name="Medium List 1 Accent 6" w:uiPriority="65"/>
+    <w:lsdException w:name="Medium List 2 Accent 6" w:uiPriority="66"/>
+    <w:lsdException w:name="Medium Grid 1 Accent 6" w:uiPriority="67"/>
+    <w:lsdException w:name="Medium Grid 2 Accent 6" w:uiPriority="68"/>
+    <w:lsdException w:name="Medium Grid 3 Accent 6" w:uiPriority="69"/>
+    <w:lsdException w:name="Dark List Accent 6" w:uiPriority="70"/>
+    <w:lsdException w:name="Colorful Shading Accent 6" w:uiPriority="71"/>
+    <w:lsdException w:name="Colorful List Accent 6" w:uiPriority="72"/>
+    <w:lsdException w:name="Colorful Grid Accent 6" w:uiPriority="73"/>
+    <w:lsdException w:name="Subtle Emphasis" w:uiPriority="19" w:qFormat="1"/>
+    <w:lsdException w:name="Intense Emphasis" w:uiPriority="21" w:qFormat="1"/>
+    <w:lsdException w:name="Subtle Reference" w:uiPriority="31" w:qFormat="1"/>
+    <w:lsdException w:name="Intense Reference" w:uiPriority="32" w:qFormat="1"/>
+    <w:lsdException w:name="Book Title" w:uiPriority="33" w:qFormat="1"/>
+    <w:lsdException w:name="Bibliography" w:semiHidden="1" w:uiPriority="37" w:unhideWhenUsed="1"/>
+    <w:lsdException w:name="TOC Heading" w:semiHidden="1" w:uiPriority="39" w:unhideWhenUsed="1" w:qFormat="1"/>
+    <w:lsdException w:name="Plain Table 1" w:uiPriority="41"/>
+    <w:lsdException w:name="Plain Table 2" w:uiPriority="42"/>
+    <w:lsdException w:name="Plain Table 3" w:uiPriority="43"/>
+    <w:lsdException w:name="Plain Table 4" w:uiPriority="44"/>
+    <w:lsdException w:name="Plain Table 5" w:uiPriority="45"/>
+    <w:lsdException w:name="Grid Table Light" w:uiPriority="40"/>
+    <w:lsdException w:name="Grid Table 1 Light" w:uiPriority="46"/>
+    <w:lsdException w:name="Grid Table 2" w:uiPriority="47"/>
+    <w:lsdException w:name="Grid Table 3" w:uiPriority="48"/>
+    <w:lsdException w:name="Grid Table 4" w:uiPriority="49"/>
+    <w:lsdException w:name="Grid Table 5 Dark" w:uiPriority="50"/>
+    <w:lsdException w:name="Grid Table 6 Colorful" w:uiPriority="51"/>
+    <w:lsdException w:name="Grid Table 7 Colorful" w:uiPriority="52"/>
+    <w:lsdException w:name="Grid Table 1 Light Accent 1" w:uiPriority="46"/>
+    <w:lsdException w:name="Grid Table 2 Accent 1" w:uiPriority="47"/>
+    <w:lsdException w:name="Grid Table 3 Accent 1" w:uiPriority="48"/>
+    <w:lsdException w:name="Grid Table 4 Accent 1" w:uiPriority="49"/>
+    <w:lsdException w:name="Grid Table 5 Dark Accent 1" w:uiPriority="50"/>
+    <w:lsdException w:name="Grid Table 6 Colorful Accent 1" w:uiPriority="51"/>
+    <w:lsdException w:name="Grid Table 7 Colorful Accent 1" w:uiPriority="52"/>
+    <w:lsdException w:name="Grid Table 1 Light Accent 2" w:uiPriority="46"/>
+    <w:lsdException w:name="Grid Table 2 Accent 2" w:uiPriority="47"/>
+    <w:lsdException w:name="Grid Table 3 Accent 2" w:uiPriority="48"/>
+    <w:lsdException w:name="Grid Table 4 Accent 2" w:uiPriority="49"/>
+    <w:lsdException w:name="Grid Table 5 Dark Accent 2" w:uiPriority="50"/>
+    <w:lsdException w:name="Grid Table 6 Colorful Accent 2" w:uiPriority="51"/>
+    <w:lsdException w:name="Grid Table 7 Colorful Accent 2" w:uiPriority="52"/>
+    <w:lsdException w:name="Grid Table 1 Light Accent 3" w:uiPriority="46"/>
+    <w:lsdException w:name="Grid Table 2 Accent 3" w:uiPriority="47"/>
+    <w:lsdException w:name="Grid Table 3 Accent 3" w:uiPriority="48"/>
+    <w:lsdException w:name="Grid Table 4 Accent 3" w:uiPriority="49"/>
+    <w:lsdException w:name="Grid Table 5 Dark Accent 3" w:uiPriority="50"/>
+    <w:lsdException w:name="Grid Table 6 Colorful Accent 3" w:uiPriority="51"/>
+    <w:lsdException w:name="Grid Table 7 Colorful Accent 3" w:uiPriority="52"/>
+    <w:lsdException w:name="Grid Table 1 Light Accent 4" w:uiPriority="46"/>
+    <w:lsdException w:name="Grid Table 2 Accent 4" w:uiPriority="47"/>
+    <w:lsdException w:name="Grid Table 3 Accent 4" w:uiPriority="48"/>
+    <w:lsdException w:name="Grid Table 4 Accent 4" w:uiPriority="49"/>
+    <w:lsdException w:name="Grid Table 5 Dark Accent 4" w:uiPriority="50"/>
+    <w:lsdException w:name="Grid Table 6 Colorful Accent 4" w:uiPriority="51"/>
+    <w:lsdException w:name="Grid Table 7 Colorful Accent 4" w:uiPriority="52"/>
+    <w:lsdException w:name="Grid Table 1 Light Accent 5" w:uiPriority="46"/>
+    <w:lsdException w:name="Grid Table 2 Accent 5" w:uiPriority="47"/>
+    <w:lsdException w:name="Grid Table 3 Accent 5" w:uiPriority="48"/>
+    <w:lsdException w:name="Grid Table 4 Accent 5" w:uiPriority="49"/>
+    <w:lsdException w:name="Grid Table 5 Dark Accent 5" w:uiPriority="50"/>
+    <w:lsdException w:name="Grid Table 6 Colorful Accent 5" w:uiPriority="51"/>
+    <w:lsdException w:name="Grid Table 7 Colorful Accent 5" w:uiPriority="52"/>
+    <w:lsdException w:name="Grid Table 1 Light Accent 6" w:uiPriority="46"/>
+    <w:lsdException w:name="Grid Table 2 Accent 6" w:uiPriority="47"/>
+    <w:lsdException w:name="Grid Table 3 Accent 6" w:uiPriority="48"/>
+    <w:lsdException w:name="Grid Table 4 Accent 6" w:uiPriority="49"/>
+    <w:lsdException w:name="Grid Table 5 Dark Accent 6" w:uiPriority="50"/>
+    <w:lsdException w:name="Grid Table 6 Colorful Accent 6" w:uiPriority="51"/>
+    <w:lsdException w:name="Grid Table 7 Colorful Accent 6" w:uiPriority="52"/>
+    <w:lsdException w:name="List Table 1 Light" w:uiPriority="46"/>
+    <w:lsdException w:name="List Table 2" w:uiPriority="47"/>
+    <w:lsdException w:name="List Table 3" w:uiPriority="48"/>
+    <w:lsdException w:name="List Table 4" w:uiPriority="49"/>
+    <w:lsdException w:name="List Table 5 Dark" w:uiPriority="50"/>
+    <w:lsdException w:name="List Table 6 Colorful" w:uiPriority="51"/>
+    <w:lsdException w:name="List Table 7 Colorful" w:uiPriority="52"/>
+    <w:lsdException w:name="List Table 1 Light Accent 1" w:uiPriority="46"/>
+    <w:lsdException w:name="List Table 2 Accent 1" w:uiPriority="47"/>
+    <w:lsdException w:name="List Table 3 Accent 1" w:uiPriority="48"/>
+    <w:lsdException w:name="List Table 4 Accent 1" w:uiPriority="49"/>
+    <w:lsdException w:name="List Table 5 Dark Accent 1" w:uiPriority="50"/>
+    <w:lsdException w:name="List Table 6 Colorful Accent 1" w:uiPriority="51"/>
+    <w:lsdException w:name="List Table 7 Colorful Accent 1" w:uiPriority="52"/>
+    <w:lsdException w:name="List Table 1 Light Accent 2" w:uiPriority="46"/>
+    <w:lsdException w:name="List Table 2 Accent 2" w:uiPriority="47"/>
+    <w:lsdException w:name="List Table 3 Accent 2" w:uiPriority="48"/>
+    <w:lsdException w:name="List Table 4 Accent 2" w:uiPriority="49"/>
+    <w:lsdException w:name="List Table 5 Dark Accent 2" w:uiPriority="50"/>
+    <w:lsdException w:name="List Table 6 Colorful Accent 2" w:uiPriority="51"/>
+    <w:lsdException w:name="List Table 7 Colorful Accent 2" w:uiPriority="52"/>
+    <w:lsdException w:name="List Table 1 Light Accent 3" w:uiPriority="46"/>
+    <w:lsdException w:name="List Table 2 Accent 3" w:uiPriority="47"/>
+    <w:lsdException w:name="List Table 3 Accent 3" w:uiPriority="48"/>
+    <w:lsdException w:name="List Table 4 Accent 3" w:uiPriority="49"/>
+    <w:lsdException w:name="List Table 5 Dark Accent 3" w:uiPriority="50"/>
+    <w:lsdException w:name="List Table 6 Colorful Accent 3" w:uiPriority="51"/>
+    <w:lsdException w:name="List Table 7 Colorful Accent 3" w:uiPriority="52"/>
+    <w:lsdException w:name="List Table 1 Light Accent 4" w:uiPriority="46"/>
+    <w:lsdException w:name="List Table 2 Accent 4" w:uiPriority="47"/>
+    <w:lsdException w:name="List Table 3 Accent 4" w:uiPriority="48"/>
+    <w:lsdException w:name="List Table 4 Accent 4" w:uiPriority="49"/>
+    <w:lsdException w:name="List Table 5 Dark Accent 4" w:uiPriority="50"/>
+    <w:lsdException w:name="List Table 6 Colorful Accent 4" w:uiPriority="51"/>
+    <w:lsdException w:name="List Table 7 Colorful Accent 4" w:uiPriority="52"/>
+    <w:lsdException w:name="List Table 1 Light Accent 5" w:uiPriority="46"/>
+    <w:lsdException w:name="List Table 2 Accent 5" w:uiPriority="47"/>
+    <w:lsdException w:name="List Table 3 Accent 5" w:uiPriority="48"/>
+    <w:lsdException w:name="List Table 4 Accent 5" w:uiPriority="49"/>
+    <w:lsdException w:name="List Table 5 Dark Accent 5" w:uiPriority="50"/>
+    <w:lsdException w:name="List Table 6 Colorful Accent 5" w:uiPriority="51"/>
+    <w:lsdException w:name="List Table 7 Colorful Accent 5" w:uiPriority="52"/>
+    <w:lsdException w:name="List Table 1 Light Accent 6" w:uiPriority="46"/>
+    <w:lsdException w:name="List Table 2 Accent 6" w:uiPriority="47"/>
+    <w:lsdException w:name="List Table 3 Accent 6" w:uiPriority="48"/>
+    <w:lsdException w:name="List Table 4 Accent 6" w:uiPriority="49"/>
+    <w:lsdException w:name="List Table 5 Dark Accent 6" w:uiPriority="50"/>
+    <w:lsdException w:name="List Table 6 Colorful Accent 6" w:uiPriority="51"/>
+    <w:lsdException w:name="List Table 7 Colorful Accent 6" w:uiPriority="52"/>
+    <w:lsdException w:name="Mention" w:semiHidden="1" w:unhideWhenUsed="1"/>
+    <w:lsdException w:name="Smart Hyperlink" w:semiHidden="1" w:unhideWhenUsed="1"/>
+    <w:lsdException w:name="Hashtag" w:semiHidden="1" w:unhideWhenUsed="1"/>
+    <w:lsdException w:name="Unresolved Mention" w:semiHidden="1" w:unhideWhenUsed="1"/>
+    <w:lsdException w:name="Smart Link" w:semiHidden="1" w:unhideWhenUsed="1"/>
+  </w:latentStyles>
+  <w:style w:type="paragraph" w:default="1" w:styleId="a">
+    <w:name w:val="Normal"/>
+    <w:qFormat/>
+    <w:pPr>
+      <w:widowControl w:val="0"/>
+      <w:wordWrap w:val="0"/>
+      <w:autoSpaceDE w:val="0"/>
+      <w:autoSpaceDN w:val="0"/>
+    </w:pPr>
+  </w:style>
+  <w:style w:type="character" w:default="1" w:styleId="a0">
+    <w:name w:val="Default Paragraph Font"/>
+    <w:uiPriority w:val="1"/>
+    <w:semiHidden/>
+    <w:unhideWhenUsed/>
+  </w:style>
+  <w:style w:type="table" w:default="1" w:styleId="a1">
+    <w:name w:val="Normal Table"/>
+    <w:uiPriority w:val="99"/>
+    <w:semiHidden/>
+    <w:unhideWhenUsed/>
+    <w:tblPr>
+      <w:tblInd w:w="0" w:type="dxa"/>
+      <w:tblCellMar>
+        <w:top w:w="0" w:type="dxa"/>
+        <w:left w:w="108" w:type="dxa"/>
+        <w:bottom w:w="0" w:type="dxa"/>
+        <w:right w:w="108" w:type="dxa"/>
+      </w:tblCellMar>
+    </w:tblPr>
+  </w:style>
+  <w:style w:type="numbering" w:default="1" w:styleId="a2">
+    <w:name w:val="No List"/>
+    <w:uiPriority w:val="99"/>
+    <w:semiHidden/>
+    <w:unhideWhenUsed/>
+  </w:style>
+  <w:style w:type="character" w:styleId="a3">
+    <w:name w:val="Placeholder Text"/>
+    <w:basedOn w:val="a0"/>
+    <w:uiPriority w:val="99"/>
+    <w:semiHidden/>
+    <w:rsid w:val="00DF1A34"/>
+    <w:rPr>
+      <w:color w:val="666666"/>
+    </w:rPr>
+  </w:style>
+  <w:style w:type="paragraph" w:customStyle="1" w:styleId="D8DD3863F4D74B06AC4C98A24CEC316B">
+    <w:name w:val="D8DD3863F4D74B06AC4C98A24CEC316B"/>
+    <w:rsid w:val="00DF1A34"/>
+    <w:pPr>
+      <w:spacing w:after="200" w:line="276" w:lineRule="auto"/>
+    </w:pPr>
+    <w:rPr>
+      <w:rFonts w:ascii="맑은 고딕" w:hAnsi="맑은 고딕"/>
+      <w:kern w:val="0"/>
+      <w:szCs w:val="22"/>
+      <w:lang w:eastAsia="en-US"/>
+      <w14:ligatures w14:val="none"/>
+    </w:rPr>
+  </w:style>
+  <w:style w:type="paragraph" w:customStyle="1" w:styleId="B1EA8BA068C145A9B32F16222DCC717F">
+    <w:name w:val="B1EA8BA068C145A9B32F16222DCC717F"/>
+    <w:rsid w:val="00DF1A34"/>
+    <w:pPr>
+      <w:spacing w:after="200" w:line="276" w:lineRule="auto"/>
+    </w:pPr>
+    <w:rPr>
+      <w:rFonts w:ascii="맑은 고딕" w:hAnsi="맑은 고딕"/>
+      <w:kern w:val="0"/>
+      <w:szCs w:val="22"/>
+      <w:lang w:eastAsia="en-US"/>
+      <w14:ligatures w14:val="none"/>
+    </w:rPr>
+  </w:style>
+  <w:style w:type="paragraph" w:customStyle="1" w:styleId="57090CC0E10D444DA4AD60358F6C2F4A">
+    <w:name w:val="57090CC0E10D444DA4AD60358F6C2F4A"/>
+    <w:rsid w:val="00DF1A34"/>
+    <w:pPr>
+      <w:spacing w:after="200" w:line="276" w:lineRule="auto"/>
+    </w:pPr>
+    <w:rPr>
+      <w:rFonts w:ascii="맑은 고딕" w:hAnsi="맑은 고딕"/>
+      <w:kern w:val="0"/>
+      <w:szCs w:val="22"/>
+      <w:lang w:eastAsia="en-US"/>
+      <w14:ligatures w14:val="none"/>
+    </w:rPr>
+  </w:style>
+</w:styles>
+</file>
+
+<file path=word/glossary/webSettings.xml><?xml version="1.0" encoding="utf-8"?>
+<w:webSettings xmlns:mc="http://schemas.openxmlformats.org/markup-compatibility/2006" xmlns:r="http://schemas.openxmlformats.org/officeDocument/2006/relationships" xmlns:w="http://schemas.openxmlformats.org/wordprocessingml/2006/main" xmlns:w14="http://schemas.microsoft.com/office/word/2010/wordml" xmlns:w15="http://schemas.microsoft.com/office/word/2012/wordml" xmlns:w16cex="http://schemas.microsoft.com/office/word/2018/wordml/cex" xmlns:w16cid="http://schemas.microsoft.com/office/word/2016/wordml/cid" xmlns:w16="http://schemas.microsoft.com/office/word/2018/wordml" xmlns:w16du="http://schemas.microsoft.com/office/word/2023/wordml/word16du" xmlns:w16sdtdh="http://schemas.microsoft.com/office/word/2020/wordml/sdtdatahash" xmlns:w16sdtfl="http://schemas.microsoft.com/office/word/2024/wordml/sdtformatlock" xmlns:w16se="http://schemas.microsoft.com/office/word/2015/wordml/symex" mc:Ignorable="w14 w15 w16se w16cid w16 w16cex w16sdtdh w16sdtfl w16du">
+  <w:optimizeForBrowser/>
+  <w:allowPNG/>
+</w:webSettings>
 </file>
 
 <file path=word/theme/theme1.xml><?xml version="1.0" encoding="utf-8"?>

</xml_diff>